<commit_message>
Paquete regenerado tras la tercera pasada, y dos guardas de fecha
El canal entero, en el orden de CLAUDE.md, con los cinco guardianes en
verde y 386 anclas al dia. El sobre vuelve a llevar el PDF de la revista.

- build_structured_abstract.py ya no reescribe el manuscrito si el resumen
  no cambia: mover su fecha dejaba el PDF maquetado "anterior a esta
  version" y el sobre salia sin el.
- Escalares s16_con_cita y s16_sin_cita_otros, y sus anclas: la lista de
  anexos decia que las 118 exclusiones llevan cita, y 67 no pueden.
- Ancla de S5 al dia: S5 no trae los excluidos.

Queda para los autores: el cuerpo del manuscrito de la revista ocupa 29
paginas contra un limite de 25.

Co-Authored-By: Claude Opus 5.5 <noreply@anthropic.com>
</commit_message>
<xml_diff>
--- a/paper/docx/datos_carta_cesion.docx
+++ b/paper/docx/datos_carta_cesion.docx
@@ -641,7 +641,7 @@
           <w:color w:val="A03020"/>
           <w:sz w:val="20"/>
         </w:rPr>
-        <w:t>OJO: la extensión no está medida sobre esta versión del manuscrito. El detalle, al final de esta hoja.</w:t>
+        <w:t>OJO: hoy no se cumplen 1: el cuerpo en 29 páginas del PDF maquetado antes de las referencias, con un límite de 25. El detalle, al final de esta hoja.</w:t>
       </w:r>
     </w:p>
     <w:p>
@@ -669,7 +669,25 @@
           <w:i w:val="0"/>
           <w:sz w:val="21"/>
         </w:rPr>
-        <w:t>Firmar el punto 8 es aceptar las normas de formato de la revista, leídas en su web el 14 de septiembre de 2026. Las cinco que fallaban ese día se corrigieron entonces: márgenes de 2,54 a 3 cm, el espacio entre párrafos consecutivos a cero, las palabras clave en orden alfabético y con las keywords en ese mismo orden, el título en mayúscula sostenida a 18 pt, y el resalte del cuerpo pasado de negrita a cursiva. La negrita se conserva donde la norma la pide o la da por supuesta: los títulos, los encabezados de sección y de tabla, y la propia lista de palabras clave, que la directriz exige «en negrita y cursiva». Hoy no se puede decir que las cumpla todas:</w:t>
+        <w:t xml:space="preserve">Firmar el punto 8 es aceptar las normas de formato de la revista, leídas en su web el 14 de septiembre de 2026. Las cinco que fallaban ese día se corrigieron entonces: márgenes de 2,54 a 3 cm, el espacio entre párrafos consecutivos a cero, las palabras clave en orden alfabético y con las keywords en ese mismo orden, el título en mayúscula sostenida a 18 pt, y el resalte del cuerpo pasado de negrita a cursiva. La negrita se conserva donde la norma la pide o la da por supuesta: los títulos, los encabezados de sección y de tabla, y la propia lista de palabras clave, que la directriz exige «en negrita y cursiva». Hoy </w:t>
+      </w:r>
+      <w:r>
+        <w:rPr>
+          <w:rFonts w:ascii="Times New Roman" w:hAnsi="Times New Roman"/>
+          <w:b w:val="0"/>
+          <w:i/>
+          <w:sz w:val="21"/>
+        </w:rPr>
+        <w:t>no cumple 1</w:t>
+      </w:r>
+      <w:r>
+        <w:rPr>
+          <w:rFonts w:ascii="Times New Roman" w:hAnsi="Times New Roman"/>
+          <w:b w:val="0"/>
+          <w:i w:val="0"/>
+          <w:sz w:val="21"/>
+        </w:rPr>
+        <w:t>:</w:t>
       </w:r>
     </w:p>
     <w:p>
@@ -684,7 +702,7 @@
           <w:i w:val="0"/>
           <w:sz w:val="21"/>
         </w:rPr>
-        <w:t>• La extensión no está medida sobre esta versión (el PDF maquetado es anterior a esta versión del manuscrito; el PDF anterior ya daba 27 páginas antes de las referencias). El límite es de 25 páginas A4 a 1,5, que en los artículos de revisión no cuentan las referencias: se mide corriendo scripts/build_jsr_pdf.py y después scripts/build_cesion_datos.py.</w:t>
+        <w:t>• el cuerpo en 29 páginas del PDF maquetado antes de las referencias, con un límite de 25.</w:t>
       </w:r>
     </w:p>
     <w:p>

</xml_diff>